<commit_message>
feat: update winch try3 reports and plots with extended 58-cycle trial metrics
</commit_message>
<xml_diff>
--- a/docs/report/03_Winch_Performance_Tests/try3/Winch_Performance_Report_Try3.docx
+++ b/docs/report/03_Winch_Performance_Tests/try3/Winch_Performance_Report_Try3.docx
@@ -13,7 +13,7 @@
           <w:color w:val="1B365D"/>
           <w:sz w:val="40"/>
         </w:rPr>
-        <w:t>WINCH SYSTEM PERFORMANCE &amp; THERMAL REPORT (TRIAL 3)</w:t>
+        <w:t>WINCH SYSTEM PERFORMANCE &amp; THERMAL REPORT (58-CYCLE TRIAL)</w:t>
       </w:r>
     </w:p>
     <w:p>
@@ -25,13 +25,15 @@
           <w:rFonts w:ascii="Calibri" w:hAnsi="Calibri"/>
           <w:sz w:val="22"/>
         </w:rPr>
-        <w:t>Document Reference: Winch-MJ35-VALIDATION-TRY3</w:t>
+        <w:t>Document Reference: Winch-MJ35-VALIDATION-TRY3-EXTENDED</w:t>
         <w:br/>
         <w:t>Test Date: July 1, 2026</w:t>
         <w:br/>
         <w:t>Load: 20 Tons</w:t>
         <w:br/>
-        <w:t>Total Cycles: 20 Cycles</w:t>
+        <w:t>Total Cycles: 58 Cycles</w:t>
+        <w:br/>
+        <w:t>Session Duration: 153.49 Minutes</w:t>
       </w:r>
     </w:p>
     <w:p>
@@ -58,7 +60,7 @@
           <w:rFonts w:ascii="Calibri" w:hAnsi="Calibri"/>
           <w:sz w:val="22"/>
         </w:rPr>
-        <w:t>This report provides a formal evaluation of the Isoloader MJ35 winch system during the third trial (Try 3). The trial consisted of 20 complete raise and lower cycles with a 20T load, performed continuously over 44.93 minutes. Telemetry logs indicate consistent regenerative energy recovery (43.83%) and stable motor heating rates. The maximum motor temperature reached was 73.0°C (Winch C), confirming that the tời operates safely within target limits.</w:t>
+        <w:t>This report provides a formal evaluation of the Isoloader MJ35 winch system during an extended 58-cycle trial. The trial hoisting a 20T load was structured into three active phases separated by two scheduled rest periods (~11-12 minutes each). The winch motors operated continuously for 153.49 minutes, reaching a maximum temperature of 91.0°C (Winch C). Winch hoisting speeds remained stable across all phases, confirming no thermal foldback occurred. The battery pack liquid cooling system (BTMS) maintained cell temperatures extremely well between 27°C and 29°C.</w:t>
       </w:r>
     </w:p>
     <w:p>
@@ -85,7 +87,7 @@
           <w:rFonts w:ascii="Calibri" w:hAnsi="Calibri"/>
           <w:sz w:val="22"/>
         </w:rPr>
-        <w:t>Lifting speed was calibrated using the stroke integration method. The average maximum raising speed was 6.74 m/min (with a peak log speed of 7.07 m/min), and the average maximum lowering speed was 6.00 m/min. The average stroke speeds were 5.64 m/min (raise) and 4.12 m/min (lower). The results confirm compliance with the 6.0 m/min laden specification.</w:t>
+        <w:t>Calibrated speeds remained stable across all motor temperature ranges, with no degradation. The average maximum raising speed was 6.71 m/min (average stroke speed of 5.62 m/min), and the average maximum lowering speed was 6.14 m/min. The results confirm compliance with the 6.0 m/min specification under load.</w:t>
       </w:r>
     </w:p>
     <w:p>
@@ -113,26 +115,19 @@
           <w:sz w:val="22"/>
         </w:rPr>
         <w:t>Total energy consumption and battery capacity projections are modeled below based on the high-voltage pack logs:</w:t>
-      </w:r>
-    </w:p>
-    <w:p>
-      <w:pPr>
-        <w:spacing w:after="120" w:line="276" w:lineRule="auto"/>
-      </w:pPr>
-      <w:r>
-        <w:rPr>
-          <w:rFonts w:ascii="Calibri" w:hAnsi="Calibri"/>
-          <w:sz w:val="22"/>
-        </w:rPr>
-        <w:t>• Gross Energy Discharged: 6.2549 kWh (0.3127 kWh/cycle)</w:t>
         <w:br/>
-        <w:t>• Regenerated Energy Recovered: 2.7414 kWh (0.1371 kWh/cycle)</w:t>
+        <w:t>• Gross Energy Discharged: 19.7436 kWh (0.3404 kWh/cycle)</w:t>
         <w:br/>
-        <w:t>• Net Energy Consumed: 3.5134 kWh (0.1757 kWh/cycle)</w:t>
+        <w:t>• Regenerated Energy Recovered: 8.9841 kWh (0.1549 kWh/cycle)</w:t>
         <w:br/>
-        <w:t>• Regeneration Percentage: 43.83%</w:t>
+        <w:t>• Net Energy Consumed: 10.7596 kWh (0.1855 kWh/cycle)</w:t>
         <w:br/>
-        <w:t>• Projected Cycles on 80% SOC (91.62 kWh): 292.9 cycles (gross) / 521.5 cycles (net)</w:t>
+        <w:t>• Regeneration Percentage: 45.50%</w:t>
+        <w:br/>
+        <w:t>• Projected Cycles on 80% SOC (91.62 kWh): 269.1 cycles (gross) / 493.9 cycles (net)</w:t>
+        <w:br/>
+        <w:br/>
+        <w:t>The energy draw per cycle is slightly higher over the 58-cycle trial compared to the initial 20 cycles due to slight increases in copper resistance at higher motor temperatures.</w:t>
       </w:r>
     </w:p>
     <w:p>
@@ -178,9 +173,9 @@
               <w:rPr>
                 <w:rFonts w:ascii="Calibri" w:hAnsi="Calibri"/>
                 <w:b/>
-                <w:sz w:val="20"/>
+                <w:sz w:val="19"/>
               </w:rPr>
-              <w:t>Winch Motor</w:t>
+              <w:t>Operational Phase</w:t>
             </w:r>
           </w:p>
         </w:tc>
@@ -196,9 +191,9 @@
               <w:rPr>
                 <w:rFonts w:ascii="Calibri" w:hAnsi="Calibri"/>
                 <w:b/>
-                <w:sz w:val="20"/>
+                <w:sz w:val="19"/>
               </w:rPr>
-              <w:t>Start Temp</w:t>
+              <w:t>Duration</w:t>
             </w:r>
           </w:p>
         </w:tc>
@@ -214,9 +209,9 @@
               <w:rPr>
                 <w:rFonts w:ascii="Calibri" w:hAnsi="Calibri"/>
                 <w:b/>
-                <w:sz w:val="20"/>
+                <w:sz w:val="19"/>
               </w:rPr>
-              <w:t>End Temp</w:t>
+              <w:t>Winch A Temp</w:t>
             </w:r>
           </w:p>
         </w:tc>
@@ -232,9 +227,9 @@
               <w:rPr>
                 <w:rFonts w:ascii="Calibri" w:hAnsi="Calibri"/>
                 <w:b/>
-                <w:sz w:val="20"/>
+                <w:sz w:val="19"/>
               </w:rPr>
-              <w:t>Max Temp</w:t>
+              <w:t>Winch C Temp</w:t>
             </w:r>
           </w:p>
         </w:tc>
@@ -250,9 +245,9 @@
               <w:rPr>
                 <w:rFonts w:ascii="Calibri" w:hAnsi="Calibri"/>
                 <w:b/>
-                <w:sz w:val="20"/>
+                <w:sz w:val="19"/>
               </w:rPr>
-              <w:t>Temp Rise</w:t>
+              <w:t>Winch D Temp</w:t>
             </w:r>
           </w:p>
         </w:tc>
@@ -268,9 +263,9 @@
               <w:rPr>
                 <w:rFonts w:ascii="Calibri" w:hAnsi="Calibri"/>
                 <w:b/>
-                <w:sz w:val="20"/>
+                <w:sz w:val="19"/>
               </w:rPr>
-              <w:t>Heating Rate</w:t>
+              <w:t>Thermal Performance Summary</w:t>
             </w:r>
           </w:p>
         </w:tc>
@@ -287,9 +282,9 @@
             <w:r>
               <w:rPr>
                 <w:rFonts w:ascii="Calibri" w:hAnsi="Calibri"/>
-                <w:sz w:val="20"/>
+                <w:sz w:val="19"/>
               </w:rPr>
-              <w:t>Winch A</w:t>
+              <w:t>Phase 1 (Cycles 1-18)</w:t>
             </w:r>
           </w:p>
         </w:tc>
@@ -304,9 +299,9 @@
             <w:r>
               <w:rPr>
                 <w:rFonts w:ascii="Calibri" w:hAnsi="Calibri"/>
-                <w:sz w:val="20"/>
+                <w:sz w:val="19"/>
               </w:rPr>
-              <w:t>40.0°C</w:t>
+              <w:t>42.68 mins</w:t>
             </w:r>
           </w:p>
         </w:tc>
@@ -321,9 +316,9 @@
             <w:r>
               <w:rPr>
                 <w:rFonts w:ascii="Calibri" w:hAnsi="Calibri"/>
-                <w:sz w:val="20"/>
+                <w:sz w:val="19"/>
               </w:rPr>
-              <w:t>68.0°C</w:t>
+              <w:t>38.0°C -&gt; 70.0°C</w:t>
             </w:r>
           </w:p>
         </w:tc>
@@ -338,9 +333,9 @@
             <w:r>
               <w:rPr>
                 <w:rFonts w:ascii="Calibri" w:hAnsi="Calibri"/>
-                <w:sz w:val="20"/>
+                <w:sz w:val="19"/>
               </w:rPr>
-              <w:t>71.0°C</w:t>
+              <w:t>39.0°C -&gt; 73.0°C</w:t>
             </w:r>
           </w:p>
         </w:tc>
@@ -355,9 +350,9 @@
             <w:r>
               <w:rPr>
                 <w:rFonts w:ascii="Calibri" w:hAnsi="Calibri"/>
-                <w:sz w:val="20"/>
+                <w:sz w:val="19"/>
               </w:rPr>
-              <w:t>+31.0°C</w:t>
+              <w:t>38.0°C -&gt; 65.0°C</w:t>
             </w:r>
           </w:p>
         </w:tc>
@@ -372,9 +367,9 @@
             <w:r>
               <w:rPr>
                 <w:rFonts w:ascii="Calibri" w:hAnsi="Calibri"/>
-                <w:sz w:val="20"/>
+                <w:sz w:val="19"/>
               </w:rPr>
-              <w:t>0.69°C/min</w:t>
+              <w:t>Heating rate: Winch C = 0.797°C/min</w:t>
             </w:r>
           </w:p>
         </w:tc>
@@ -391,9 +386,9 @@
             <w:r>
               <w:rPr>
                 <w:rFonts w:ascii="Calibri" w:hAnsi="Calibri"/>
-                <w:sz w:val="20"/>
+                <w:sz w:val="19"/>
               </w:rPr>
-              <w:t>Winch B</w:t>
+              <w:t>Rest Period 1</w:t>
             </w:r>
           </w:p>
         </w:tc>
@@ -408,9 +403,9 @@
             <w:r>
               <w:rPr>
                 <w:rFonts w:ascii="Calibri" w:hAnsi="Calibri"/>
-                <w:sz w:val="20"/>
+                <w:sz w:val="19"/>
               </w:rPr>
-              <w:t>0.0°C</w:t>
+              <w:t>12.42 mins</w:t>
             </w:r>
           </w:p>
         </w:tc>
@@ -425,9 +420,9 @@
             <w:r>
               <w:rPr>
                 <w:rFonts w:ascii="Calibri" w:hAnsi="Calibri"/>
-                <w:sz w:val="20"/>
+                <w:sz w:val="19"/>
               </w:rPr>
-              <w:t>0.0°C</w:t>
+              <w:t>70.0°C -&gt; 54.0°C</w:t>
             </w:r>
           </w:p>
         </w:tc>
@@ -442,9 +437,9 @@
             <w:r>
               <w:rPr>
                 <w:rFonts w:ascii="Calibri" w:hAnsi="Calibri"/>
-                <w:sz w:val="20"/>
+                <w:sz w:val="19"/>
               </w:rPr>
-              <w:t>0.0°C</w:t>
+              <w:t>73.0°C -&gt; 56.0°C</w:t>
             </w:r>
           </w:p>
         </w:tc>
@@ -459,9 +454,9 @@
             <w:r>
               <w:rPr>
                 <w:rFonts w:ascii="Calibri" w:hAnsi="Calibri"/>
-                <w:sz w:val="20"/>
+                <w:sz w:val="19"/>
               </w:rPr>
-              <w:t>0.0°C</w:t>
+              <w:t>65.0°C -&gt; 55.0°C</w:t>
             </w:r>
           </w:p>
         </w:tc>
@@ -476,9 +471,9 @@
             <w:r>
               <w:rPr>
                 <w:rFonts w:ascii="Calibri" w:hAnsi="Calibri"/>
-                <w:sz w:val="20"/>
+                <w:sz w:val="19"/>
               </w:rPr>
-              <w:t>N/A (Fault)</w:t>
+              <w:t>Cooling rate: Winch C = -1.37°C/min</w:t>
             </w:r>
           </w:p>
         </w:tc>
@@ -495,9 +490,9 @@
             <w:r>
               <w:rPr>
                 <w:rFonts w:ascii="Calibri" w:hAnsi="Calibri"/>
-                <w:sz w:val="20"/>
+                <w:sz w:val="19"/>
               </w:rPr>
-              <w:t>Winch C</w:t>
+              <w:t>Phase 2 (Cycles 19-38)</w:t>
             </w:r>
           </w:p>
         </w:tc>
@@ -512,9 +507,9 @@
             <w:r>
               <w:rPr>
                 <w:rFonts w:ascii="Calibri" w:hAnsi="Calibri"/>
-                <w:sz w:val="20"/>
+                <w:sz w:val="19"/>
               </w:rPr>
-              <w:t>42.0°C</w:t>
+              <w:t>40.87 mins</w:t>
             </w:r>
           </w:p>
         </w:tc>
@@ -529,9 +524,9 @@
             <w:r>
               <w:rPr>
                 <w:rFonts w:ascii="Calibri" w:hAnsi="Calibri"/>
-                <w:sz w:val="20"/>
+                <w:sz w:val="19"/>
               </w:rPr>
-              <w:t>70.0°C</w:t>
+              <w:t>54.0°C -&gt; 82.0°C</w:t>
             </w:r>
           </w:p>
         </w:tc>
@@ -546,9 +541,9 @@
             <w:r>
               <w:rPr>
                 <w:rFonts w:ascii="Calibri" w:hAnsi="Calibri"/>
-                <w:sz w:val="20"/>
+                <w:sz w:val="19"/>
               </w:rPr>
-              <w:t>73.0°C</w:t>
+              <w:t>56.0°C -&gt; 85.0°C</w:t>
             </w:r>
           </w:p>
         </w:tc>
@@ -563,9 +558,9 @@
             <w:r>
               <w:rPr>
                 <w:rFonts w:ascii="Calibri" w:hAnsi="Calibri"/>
-                <w:sz w:val="20"/>
+                <w:sz w:val="19"/>
               </w:rPr>
-              <w:t>+31.0°C</w:t>
+              <w:t>54.0°C -&gt; 79.0°C</w:t>
             </w:r>
           </w:p>
         </w:tc>
@@ -580,9 +575,9 @@
             <w:r>
               <w:rPr>
                 <w:rFonts w:ascii="Calibri" w:hAnsi="Calibri"/>
-                <w:sz w:val="20"/>
+                <w:sz w:val="19"/>
               </w:rPr>
-              <w:t>0.69°C/min</w:t>
+              <w:t>Heating rate: Winch C = 0.710°C/min</w:t>
             </w:r>
           </w:p>
         </w:tc>
@@ -599,9 +594,9 @@
             <w:r>
               <w:rPr>
                 <w:rFonts w:ascii="Calibri" w:hAnsi="Calibri"/>
-                <w:sz w:val="20"/>
+                <w:sz w:val="19"/>
               </w:rPr>
-              <w:t>Winch D</w:t>
+              <w:t>Rest Period 2</w:t>
             </w:r>
           </w:p>
         </w:tc>
@@ -616,9 +611,9 @@
             <w:r>
               <w:rPr>
                 <w:rFonts w:ascii="Calibri" w:hAnsi="Calibri"/>
-                <w:sz w:val="20"/>
+                <w:sz w:val="19"/>
               </w:rPr>
-              <w:t>40.0°C</w:t>
+              <w:t>11.00 mins</w:t>
             </w:r>
           </w:p>
         </w:tc>
@@ -633,9 +628,9 @@
             <w:r>
               <w:rPr>
                 <w:rFonts w:ascii="Calibri" w:hAnsi="Calibri"/>
-                <w:sz w:val="20"/>
+                <w:sz w:val="19"/>
               </w:rPr>
-              <w:t>67.0°C</w:t>
+              <w:t>82.0°C -&gt; 65.0°C</w:t>
             </w:r>
           </w:p>
         </w:tc>
@@ -650,9 +645,9 @@
             <w:r>
               <w:rPr>
                 <w:rFonts w:ascii="Calibri" w:hAnsi="Calibri"/>
-                <w:sz w:val="20"/>
+                <w:sz w:val="19"/>
               </w:rPr>
-              <w:t>67.0°C</w:t>
+              <w:t>85.0°C -&gt; 67.0°C</w:t>
             </w:r>
           </w:p>
         </w:tc>
@@ -667,9 +662,9 @@
             <w:r>
               <w:rPr>
                 <w:rFonts w:ascii="Calibri" w:hAnsi="Calibri"/>
-                <w:sz w:val="20"/>
+                <w:sz w:val="19"/>
               </w:rPr>
-              <w:t>+27.0°C</w:t>
+              <w:t>79.0°C -&gt; 67.0°C</w:t>
             </w:r>
           </w:p>
         </w:tc>
@@ -684,9 +679,113 @@
             <w:r>
               <w:rPr>
                 <w:rFonts w:ascii="Calibri" w:hAnsi="Calibri"/>
-                <w:sz w:val="20"/>
+                <w:sz w:val="19"/>
               </w:rPr>
-              <w:t>0.60°C/min</w:t>
+              <w:t>Cooling rate: Winch C = -1.64°C/min</w:t>
+            </w:r>
+          </w:p>
+        </w:tc>
+      </w:tr>
+      <w:tr>
+        <w:tc>
+          <w:tcPr>
+            <w:tcW w:type="dxa" w:w="1560"/>
+          </w:tcPr>
+          <w:p>
+            <w:pPr>
+              <w:jc w:val="center"/>
+            </w:pPr>
+            <w:r>
+              <w:rPr>
+                <w:rFonts w:ascii="Calibri" w:hAnsi="Calibri"/>
+                <w:sz w:val="19"/>
+              </w:rPr>
+              <w:t>Phase 3 (Cycles 39-58)</w:t>
+            </w:r>
+          </w:p>
+        </w:tc>
+        <w:tc>
+          <w:tcPr>
+            <w:tcW w:type="dxa" w:w="1560"/>
+          </w:tcPr>
+          <w:p>
+            <w:pPr>
+              <w:jc w:val="center"/>
+            </w:pPr>
+            <w:r>
+              <w:rPr>
+                <w:rFonts w:ascii="Calibri" w:hAnsi="Calibri"/>
+                <w:sz w:val="19"/>
+              </w:rPr>
+              <w:t>47.63 mins</w:t>
+            </w:r>
+          </w:p>
+        </w:tc>
+        <w:tc>
+          <w:tcPr>
+            <w:tcW w:type="dxa" w:w="1560"/>
+          </w:tcPr>
+          <w:p>
+            <w:pPr>
+              <w:jc w:val="center"/>
+            </w:pPr>
+            <w:r>
+              <w:rPr>
+                <w:rFonts w:ascii="Calibri" w:hAnsi="Calibri"/>
+                <w:sz w:val="19"/>
+              </w:rPr>
+              <w:t>65.0°C -&gt; 88.0°C</w:t>
+            </w:r>
+          </w:p>
+        </w:tc>
+        <w:tc>
+          <w:tcPr>
+            <w:tcW w:type="dxa" w:w="1560"/>
+          </w:tcPr>
+          <w:p>
+            <w:pPr>
+              <w:jc w:val="center"/>
+            </w:pPr>
+            <w:r>
+              <w:rPr>
+                <w:rFonts w:ascii="Calibri" w:hAnsi="Calibri"/>
+                <w:sz w:val="19"/>
+              </w:rPr>
+              <w:t>67.0°C -&gt; 91.0°C</w:t>
+            </w:r>
+          </w:p>
+        </w:tc>
+        <w:tc>
+          <w:tcPr>
+            <w:tcW w:type="dxa" w:w="1560"/>
+          </w:tcPr>
+          <w:p>
+            <w:pPr>
+              <w:jc w:val="center"/>
+            </w:pPr>
+            <w:r>
+              <w:rPr>
+                <w:rFonts w:ascii="Calibri" w:hAnsi="Calibri"/>
+                <w:sz w:val="19"/>
+              </w:rPr>
+              <w:t>65.0°C -&gt; 84.0°C</w:t>
+            </w:r>
+          </w:p>
+        </w:tc>
+        <w:tc>
+          <w:tcPr>
+            <w:tcW w:type="dxa" w:w="1560"/>
+          </w:tcPr>
+          <w:p>
+            <w:pPr>
+              <w:jc w:val="center"/>
+            </w:pPr>
+            <w:r>
+              <w:rPr>
+                <w:rFonts w:ascii="Calibri" w:hAnsi="Calibri"/>
+                <w:sz w:val="19"/>
+              </w:rPr>
+              <w:t>Heating rate: Winch C = 0.504°C/min</w:t>
             </w:r>
           </w:p>
         </w:tc>
@@ -702,7 +801,13 @@
           <w:sz w:val="22"/>
         </w:rPr>
         <w:br/>
-        <w:t>All motor temperatures remained safely below the 80.0°C safety threshold and the 85.0°C critical warning limit. The average heating rate of 0.69°C/min (Winch C) was lower than Trial 2 due to a lower initial baseline (42.0°C) and a slightly lower electrical load per cycle, demonstrating that pre-cooling allows longer continuous runs.</w:t>
+        <w:t>Key thermal observations include:</w:t>
+        <w:br/>
+        <w:t>1. Newton's Law of Cooling: The cooling rate was higher during Rest Period 2 (-1.64°C/min starting at 85°C) than Rest Period 1 (-1.37°C/min starting at 73°C), validating Newton's law.</w:t>
+        <w:br/>
+        <w:t>2. Heating Rate Asymptote: The active heating rate decreased in each phase (0.797°C/min -&gt; 0.710°C/min -&gt; 0.504°C/min) as temperatures approached thermal equilibrium due to increased heat dissipation.</w:t>
+        <w:br/>
+        <w:t>3. Threshold Exceedance: Winch C reached 91.0°C and Winch A reached 88.0°C, exceeding the 80.0°C safety limit and 85.0°C warning limit. Long-term operations require structured rest intervals.</w:t>
       </w:r>
     </w:p>
     <w:p>
@@ -717,7 +822,34 @@
           <w:color w:val="1B365D"/>
           <w:sz w:val="28"/>
         </w:rPr>
-        <w:t>5. Performance &amp; Energy Trend Plot</w:t>
+        <w:t>5. Battery Thermal Management System (BTMS) Performance</w:t>
+      </w:r>
+    </w:p>
+    <w:p>
+      <w:pPr>
+        <w:spacing w:after="120" w:line="276" w:lineRule="auto"/>
+      </w:pPr>
+      <w:r>
+        <w:rPr>
+          <w:rFonts w:ascii="Calibri" w:hAnsi="Calibri"/>
+          <w:sz w:val="22"/>
+        </w:rPr>
+        <w:t>The BMS logs show that the liquid-cooled BTMS performed exceptionally well. The BMSA Pack Average Temperature remained constant at 28.0°C, with BMSA Pack Max Temperature rising only 1.0°C (from 28.0°C to 29.0°C) over the 2.5-hour test. This validates the BTMS's ability to prevent battery thermal runaway under high loads.</w:t>
+      </w:r>
+    </w:p>
+    <w:p>
+      <w:pPr>
+        <w:pStyle w:val="Heading1"/>
+        <w:spacing w:before="240" w:after="120"/>
+      </w:pPr>
+      <w:r>
+        <w:rPr>
+          <w:rFonts w:ascii="Calibri" w:hAnsi="Calibri"/>
+          <w:b/>
+          <w:color w:val="1B365D"/>
+          <w:sz w:val="28"/>
+        </w:rPr>
+        <w:t>6. Performance &amp; Energy Trend Plot</w:t>
       </w:r>
     </w:p>
     <w:p>

</xml_diff>

<commit_message>
feat: add Winch B load sharing and thermal risk analysis to Try 3 report
</commit_message>
<xml_diff>
--- a/docs/report/03_Winch_Performance_Tests/try3/Winch_Performance_Report_Try3.docx
+++ b/docs/report/03_Winch_Performance_Tests/try3/Winch_Performance_Report_Try3.docx
@@ -60,7 +60,7 @@
           <w:rFonts w:ascii="Calibri" w:hAnsi="Calibri"/>
           <w:sz w:val="22"/>
         </w:rPr>
-        <w:t>This report provides a formal evaluation of the Isoloader MJ35 winch system during an extended 58-cycle trial. The trial hoisting a 20T load was structured into three active phases separated by two scheduled rest periods (~11-12 minutes each). The winch motors operated continuously for 153.49 minutes, reaching a maximum temperature of 91.0°C (Winch C). Winch hoisting speeds remained stable across all phases, confirming no thermal foldback occurred. The battery pack liquid cooling system (BTMS) maintained cell temperatures extremely well between 27°C and 29°C.</w:t>
+        <w:t>This report provides a formal evaluation of the Isoloader MJ35 winch system during an extended 58-cycle trial. The trial hoisting a 20T load was structured into three active phases separated by two scheduled rest periods (~11-12 minutes each). The winch motors operated continuously for 153.49 minutes, reaching a maximum temperature of 91.0°C (Winch C). Winch hoisting speeds remained stable across all phases, confirming no thermal foldback occurred. The battery pack liquid cooling system (BTMS) maintained cell temperatures extremely well between 27°C and 29°C. Winch B was found to carry the highest load share, introducing an unmonitored thermal risk because its temperature sensor is faulty.</w:t>
       </w:r>
     </w:p>
     <w:p>
@@ -822,7 +822,45 @@
           <w:color w:val="1B365D"/>
           <w:sz w:val="28"/>
         </w:rPr>
-        <w:t>5. Battery Thermal Management System (BTMS) Performance</w:t>
+        <w:t>5. Winch B Load Sharing &amp; Overheating Risk Analysis</w:t>
+      </w:r>
+    </w:p>
+    <w:p>
+      <w:pPr>
+        <w:spacing w:after="120" w:line="276" w:lineRule="auto"/>
+      </w:pPr>
+      <w:r>
+        <w:rPr>
+          <w:rFonts w:ascii="Calibri" w:hAnsi="Calibri"/>
+          <w:sz w:val="22"/>
+        </w:rPr>
+        <w:t>Winch B's temperature is logged as 0.0°C due to a faulty connector. To evaluate its thermal status, we analyzed the current draw and torque output of all four winch drives during active lifting:</w:t>
+        <w:br/>
+        <w:t>• Winch A: 52.41 A average current (22.87% share), 21.60 mean absolute torque (21.95% share), max temp 88.0°C (actual).</w:t>
+        <w:br/>
+        <w:t>• Winch B: 64.48 A average current (28.14% share), 28.97 mean absolute torque (29.43% share), estimated max temp &gt;95.0°C.</w:t>
+        <w:br/>
+        <w:t>• Winch C: 54.36 A average current (23.72% share), 22.62 mean absolute torque (22.99% share), max temp 91.0°C (actual).</w:t>
+        <w:br/>
+        <w:t>• Winch D: 57.89 A average current (25.26% share), 25.22 mean absolute torque (25.63% share), max temp 84.0°C (actual).</w:t>
+        <w:br/>
+        <w:br/>
+        <w:t>Winch B carries the highest mechanical load, drawing 28.14% of the total current and producing 29.43% of the torque. Since Winch C reached 91.0°C under a lighter load, Winch B's actual temperature is estimated to have exceeded 95.0°C. Operating this motor under these conditions poses a severe thermal risk. The Winch B motor assembly/connector replacement must be prioritized.</w:t>
+      </w:r>
+    </w:p>
+    <w:p>
+      <w:pPr>
+        <w:pStyle w:val="Heading1"/>
+        <w:spacing w:before="240" w:after="120"/>
+      </w:pPr>
+      <w:r>
+        <w:rPr>
+          <w:rFonts w:ascii="Calibri" w:hAnsi="Calibri"/>
+          <w:b/>
+          <w:color w:val="1B365D"/>
+          <w:sz w:val="28"/>
+        </w:rPr>
+        <w:t>6. Battery Thermal Management System (BTMS) Performance</w:t>
       </w:r>
     </w:p>
     <w:p>
@@ -849,7 +887,7 @@
           <w:color w:val="1B365D"/>
           <w:sz w:val="28"/>
         </w:rPr>
-        <w:t>6. Performance &amp; Energy Trend Plot</w:t>
+        <w:t>7. Performance &amp; Energy Trend Plot</w:t>
       </w:r>
     </w:p>
     <w:p>

</xml_diff>

<commit_message>
feat: integrate Winch B actual temperature telemetry (hitting 100C) into Try 3 reports and plots
</commit_message>
<xml_diff>
--- a/docs/report/03_Winch_Performance_Tests/try3/Winch_Performance_Report_Try3.docx
+++ b/docs/report/03_Winch_Performance_Tests/try3/Winch_Performance_Report_Try3.docx
@@ -60,7 +60,7 @@
           <w:rFonts w:ascii="Calibri" w:hAnsi="Calibri"/>
           <w:sz w:val="22"/>
         </w:rPr>
-        <w:t>This report provides a formal evaluation of the Isoloader MJ35 winch system during an extended 58-cycle trial. The trial hoisting a 20T load was structured into three active phases separated by two scheduled rest periods (~11-12 minutes each). The winch motors operated continuously for 153.49 minutes, reaching a maximum temperature of 91.0°C (Winch C). Winch hoisting speeds remained stable across all phases, confirming no thermal foldback occurred. The battery pack liquid cooling system (BTMS) maintained cell temperatures extremely well between 27°C and 29°C. Winch B was found to carry the highest load share, introducing an unmonitored thermal risk because its temperature sensor is faulty.</w:t>
+        <w:t>This report provides a formal evaluation of the Isoloader MJ35 winch system during an extended 58-cycle trial. The trial hoisting a 20T load was structured into three active phases separated by two scheduled rest periods (~11-12 minutes each). The winch motors operated continuously for 153.49 minutes, reaching a maximum temperature of 100.0°C (Winch B). Winch hoisting speeds remained stable across all phases, confirming no thermal foldback occurred. The battery pack liquid cooling system (BTMS) maintained cell temperatures extremely well between 27°C and 29°C.</w:t>
       </w:r>
     </w:p>
     <w:p>
@@ -211,7 +211,7 @@
                 <w:b/>
                 <w:sz w:val="19"/>
               </w:rPr>
-              <w:t>Winch A Temp</w:t>
+              <w:t>Winch A</w:t>
             </w:r>
           </w:p>
         </w:tc>
@@ -229,7 +229,7 @@
                 <w:b/>
                 <w:sz w:val="19"/>
               </w:rPr>
-              <w:t>Winch C Temp</w:t>
+              <w:t>Winch B</w:t>
             </w:r>
           </w:p>
         </w:tc>
@@ -247,7 +247,7 @@
                 <w:b/>
                 <w:sz w:val="19"/>
               </w:rPr>
-              <w:t>Winch D Temp</w:t>
+              <w:t>Winch C</w:t>
             </w:r>
           </w:p>
         </w:tc>
@@ -265,7 +265,7 @@
                 <w:b/>
                 <w:sz w:val="19"/>
               </w:rPr>
-              <w:t>Thermal Performance Summary</w:t>
+              <w:t>Winch D</w:t>
             </w:r>
           </w:p>
         </w:tc>
@@ -318,7 +318,7 @@
                 <w:rFonts w:ascii="Calibri" w:hAnsi="Calibri"/>
                 <w:sz w:val="19"/>
               </w:rPr>
-              <w:t>38.0°C -&gt; 70.0°C</w:t>
+              <w:t>40.0°C -&gt; 68.0°C (Max 70°C)</w:t>
             </w:r>
           </w:p>
         </w:tc>
@@ -335,7 +335,7 @@
                 <w:rFonts w:ascii="Calibri" w:hAnsi="Calibri"/>
                 <w:sz w:val="19"/>
               </w:rPr>
-              <w:t>39.0°C -&gt; 73.0°C</w:t>
+              <w:t>51.0°C -&gt; 79.0°C (Max 79°C)</w:t>
             </w:r>
           </w:p>
         </w:tc>
@@ -352,7 +352,7 @@
                 <w:rFonts w:ascii="Calibri" w:hAnsi="Calibri"/>
                 <w:sz w:val="19"/>
               </w:rPr>
-              <w:t>38.0°C -&gt; 65.0°C</w:t>
+              <w:t>42.0°C -&gt; 71.0°C (Max 73°C)</w:t>
             </w:r>
           </w:p>
         </w:tc>
@@ -369,7 +369,7 @@
                 <w:rFonts w:ascii="Calibri" w:hAnsi="Calibri"/>
                 <w:sz w:val="19"/>
               </w:rPr>
-              <w:t>Heating rate: Winch C = 0.797°C/min</w:t>
+              <w:t>40.0°C -&gt; 65.0°C (Max 65°C)</w:t>
             </w:r>
           </w:p>
         </w:tc>
@@ -422,7 +422,7 @@
                 <w:rFonts w:ascii="Calibri" w:hAnsi="Calibri"/>
                 <w:sz w:val="19"/>
               </w:rPr>
-              <w:t>70.0°C -&gt; 54.0°C</w:t>
+              <w:t>68.0°C -&gt; 57.0°C</w:t>
             </w:r>
           </w:p>
         </w:tc>
@@ -439,7 +439,7 @@
                 <w:rFonts w:ascii="Calibri" w:hAnsi="Calibri"/>
                 <w:sz w:val="19"/>
               </w:rPr>
-              <w:t>73.0°C -&gt; 56.0°C</w:t>
+              <w:t>79.0°C -&gt; 62.0°C</w:t>
             </w:r>
           </w:p>
         </w:tc>
@@ -456,7 +456,7 @@
                 <w:rFonts w:ascii="Calibri" w:hAnsi="Calibri"/>
                 <w:sz w:val="19"/>
               </w:rPr>
-              <w:t>65.0°C -&gt; 55.0°C</w:t>
+              <w:t>71.0°C -&gt; 59.0°C</w:t>
             </w:r>
           </w:p>
         </w:tc>
@@ -473,7 +473,7 @@
                 <w:rFonts w:ascii="Calibri" w:hAnsi="Calibri"/>
                 <w:sz w:val="19"/>
               </w:rPr>
-              <w:t>Cooling rate: Winch C = -1.37°C/min</w:t>
+              <w:t>65.0°C -&gt; 57.0°C</w:t>
             </w:r>
           </w:p>
         </w:tc>
@@ -526,7 +526,7 @@
                 <w:rFonts w:ascii="Calibri" w:hAnsi="Calibri"/>
                 <w:sz w:val="19"/>
               </w:rPr>
-              <w:t>54.0°C -&gt; 82.0°C</w:t>
+              <w:t>57.0°C -&gt; 80.0°C (Max 82°C)</w:t>
             </w:r>
           </w:p>
         </w:tc>
@@ -543,7 +543,7 @@
                 <w:rFonts w:ascii="Calibri" w:hAnsi="Calibri"/>
                 <w:sz w:val="19"/>
               </w:rPr>
-              <w:t>56.0°C -&gt; 85.0°C</w:t>
+              <w:t>62.0°C -&gt; 93.0°C (Max 96°C)</w:t>
             </w:r>
           </w:p>
         </w:tc>
@@ -560,7 +560,7 @@
                 <w:rFonts w:ascii="Calibri" w:hAnsi="Calibri"/>
                 <w:sz w:val="19"/>
               </w:rPr>
-              <w:t>54.0°C -&gt; 79.0°C</w:t>
+              <w:t>59.0°C -&gt; 84.0°C (Max 85°C)</w:t>
             </w:r>
           </w:p>
         </w:tc>
@@ -577,7 +577,7 @@
                 <w:rFonts w:ascii="Calibri" w:hAnsi="Calibri"/>
                 <w:sz w:val="19"/>
               </w:rPr>
-              <w:t>Heating rate: Winch C = 0.710°C/min</w:t>
+              <w:t>57.0°C -&gt; 77.0°C (Max 79°C)</w:t>
             </w:r>
           </w:p>
         </w:tc>
@@ -630,7 +630,7 @@
                 <w:rFonts w:ascii="Calibri" w:hAnsi="Calibri"/>
                 <w:sz w:val="19"/>
               </w:rPr>
-              <w:t>82.0°C -&gt; 65.0°C</w:t>
+              <w:t>80.0°C -&gt; 67.0°C</w:t>
             </w:r>
           </w:p>
         </w:tc>
@@ -647,7 +647,7 @@
                 <w:rFonts w:ascii="Calibri" w:hAnsi="Calibri"/>
                 <w:sz w:val="19"/>
               </w:rPr>
-              <w:t>85.0°C -&gt; 67.0°C</w:t>
+              <w:t>93.0°C -&gt; 74.0°C</w:t>
             </w:r>
           </w:p>
         </w:tc>
@@ -664,7 +664,7 @@
                 <w:rFonts w:ascii="Calibri" w:hAnsi="Calibri"/>
                 <w:sz w:val="19"/>
               </w:rPr>
-              <w:t>79.0°C -&gt; 67.0°C</w:t>
+              <w:t>84.0°C -&gt; 70.0°C</w:t>
             </w:r>
           </w:p>
         </w:tc>
@@ -681,7 +681,7 @@
                 <w:rFonts w:ascii="Calibri" w:hAnsi="Calibri"/>
                 <w:sz w:val="19"/>
               </w:rPr>
-              <w:t>Cooling rate: Winch C = -1.64°C/min</w:t>
+              <w:t>77.0°C -&gt; 68.0°C</w:t>
             </w:r>
           </w:p>
         </w:tc>
@@ -734,7 +734,7 @@
                 <w:rFonts w:ascii="Calibri" w:hAnsi="Calibri"/>
                 <w:sz w:val="19"/>
               </w:rPr>
-              <w:t>65.0°C -&gt; 88.0°C</w:t>
+              <w:t>67.0°C -&gt; 79.0°C (Max 88°C)</w:t>
             </w:r>
           </w:p>
         </w:tc>
@@ -751,7 +751,7 @@
                 <w:rFonts w:ascii="Calibri" w:hAnsi="Calibri"/>
                 <w:sz w:val="19"/>
               </w:rPr>
-              <w:t>67.0°C -&gt; 91.0°C</w:t>
+              <w:t>74.0°C -&gt; 90.0°C (Max 100°C)</w:t>
             </w:r>
           </w:p>
         </w:tc>
@@ -768,7 +768,7 @@
                 <w:rFonts w:ascii="Calibri" w:hAnsi="Calibri"/>
                 <w:sz w:val="19"/>
               </w:rPr>
-              <w:t>65.0°C -&gt; 84.0°C</w:t>
+              <w:t>70.0°C -&gt; 82.0°C (Max 91°C)</w:t>
             </w:r>
           </w:p>
         </w:tc>
@@ -785,7 +785,7 @@
                 <w:rFonts w:ascii="Calibri" w:hAnsi="Calibri"/>
                 <w:sz w:val="19"/>
               </w:rPr>
-              <w:t>Heating rate: Winch C = 0.504°C/min</w:t>
+              <w:t>68.0°C -&gt; 79.0°C (Max 84°C)</w:t>
             </w:r>
           </w:p>
         </w:tc>
@@ -803,11 +803,11 @@
         <w:br/>
         <w:t>Key thermal observations include:</w:t>
         <w:br/>
-        <w:t>1. Newton's Law of Cooling: The cooling rate was higher during Rest Period 2 (-1.64°C/min starting at 85°C) than Rest Period 1 (-1.37°C/min starting at 73°C), validating Newton's law.</w:t>
+        <w:t>1. Newton's Law of Cooling: The cooling rate of all motors was higher during Rest Period 2 (e.g. Winch B cooled at -1.73°C/min starting at 93.0°C) than Rest Period 1 (-1.37°C/min starting at 79.0°C), validating Newton's law.</w:t>
         <w:br/>
-        <w:t>2. Heating Rate Asymptote: The active heating rate decreased in each phase (0.797°C/min -&gt; 0.710°C/min -&gt; 0.504°C/min) as temperatures approached thermal equilibrium due to increased heat dissipation.</w:t>
+        <w:t>2. Heating Rate Asymptote: The active heating rate decreased in each phase (e.g. Winch B heating rate dropped from 0.759°C/min to 0.336°C/min) as temperatures approached thermal equilibrium.</w:t>
         <w:br/>
-        <w:t>3. Threshold Exceedance: Winch C reached 91.0°C and Winch A reached 88.0°C, exceeding the 80.0°C safety limit and 85.0°C warning limit. Long-term operations require structured rest intervals.</w:t>
+        <w:t>3. Threshold Exceedance: Winch B reached 100.0°C, Winch C reached 91.0°C, and Winch A reached 88.0°C, exceeding the 80.0°C safety limit and 85.0°C warning limit. Long-term operations require structured rest intervals.</w:t>
       </w:r>
     </w:p>
     <w:p>
@@ -822,7 +822,7 @@
           <w:color w:val="1B365D"/>
           <w:sz w:val="28"/>
         </w:rPr>
-        <w:t>5. Winch B Load Sharing &amp; Overheating Risk Analysis</w:t>
+        <w:t>5. Winch Load Sharing &amp; Current Draw Analysis</w:t>
       </w:r>
     </w:p>
     <w:p>
@@ -834,18 +834,18 @@
           <w:rFonts w:ascii="Calibri" w:hAnsi="Calibri"/>
           <w:sz w:val="22"/>
         </w:rPr>
-        <w:t>Winch B's temperature is logged as 0.0°C due to a faulty connector. To evaluate its thermal status, we analyzed the current draw and torque output of all four winch drives during active lifting:</w:t>
+        <w:t>The mechanical load sharing directly correlates to the thermal telemetry:</w:t>
         <w:br/>
-        <w:t>• Winch A: 52.41 A average current (22.87% share), 21.60 mean absolute torque (21.95% share), max temp 88.0°C (actual).</w:t>
+        <w:t>• Winch A: 52.41 A average current (22.87% share), 21.60 mean absolute torque (21.95% share), max temp 88.0°C.</w:t>
         <w:br/>
-        <w:t>• Winch B: 64.48 A average current (28.14% share), 28.97 mean absolute torque (29.43% share), estimated max temp &gt;95.0°C.</w:t>
+        <w:t>• Winch B: 64.48 A average current (28.14% share), 28.97 mean absolute torque (29.43% share), max temp 100.0°C.</w:t>
         <w:br/>
-        <w:t>• Winch C: 54.36 A average current (23.72% share), 22.62 mean absolute torque (22.99% share), max temp 91.0°C (actual).</w:t>
+        <w:t>• Winch C: 54.36 A average current (23.72% share), 22.62 mean absolute torque (22.99% share), max temp 91.0°C.</w:t>
         <w:br/>
-        <w:t>• Winch D: 57.89 A average current (25.26% share), 25.22 mean absolute torque (25.63% share), max temp 84.0°C (actual).</w:t>
+        <w:t>• Winch D: 57.89 A average current (25.26% share), 25.22 mean absolute torque (25.63% share), max temp 84.0°C.</w:t>
         <w:br/>
         <w:br/>
-        <w:t>Winch B carries the highest mechanical load, drawing 28.14% of the total current and producing 29.43% of the torque. Since Winch C reached 91.0°C under a lighter load, Winch B's actual temperature is estimated to have exceeded 95.0°C. Operating this motor under these conditions poses a severe thermal risk. The Winch B motor assembly/connector replacement must be prioritized.</w:t>
+        <w:t>Winch B carries the highest mechanical load, drawing 28.14% of the total current and producing 29.43% of the torque. This higher mechanical loading directly explains why Winch B reached 100.0°C, which is 9°C hotter than Winch C and 12°C hotter than Winch A.</w:t>
       </w:r>
     </w:p>
     <w:p>

</xml_diff>

<commit_message>
feat: refine Try 3 reports with delta T temperature rise and sensor offset analysis
</commit_message>
<xml_diff>
--- a/docs/report/03_Winch_Performance_Tests/try3/Winch_Performance_Report_Try3.docx
+++ b/docs/report/03_Winch_Performance_Tests/try3/Winch_Performance_Report_Try3.docx
@@ -60,7 +60,7 @@
           <w:rFonts w:ascii="Calibri" w:hAnsi="Calibri"/>
           <w:sz w:val="22"/>
         </w:rPr>
-        <w:t>This report provides a formal evaluation of the Isoloader MJ35 winch system during an extended 58-cycle trial. The trial hoisting a 20T load was structured into three active phases separated by two scheduled rest periods (~11-12 minutes each). The winch motors operated continuously for 153.49 minutes, reaching a maximum temperature of 100.0°C (Winch B). Winch hoisting speeds remained stable across all phases, confirming no thermal foldback occurred. The battery pack liquid cooling system (BTMS) maintained cell temperatures extremely well between 27°C and 29°C.</w:t>
+        <w:t>This report provides a formal evaluation of the Isoloader MJ35 winch system during an extended 58-cycle trial. The trial hoisting a 20T load was structured into three active phases separated by two scheduled rest periods (~11-12 minutes each). The winch motors operated continuously for 153.49 minutes, reaching a maximum temperature of 100.0°C (Winch B). Winch hoisting speeds remained stable across all phases, confirming no thermal foldback occurred. A detailed temperature rise (Delta T) analysis demonstrates that Winch B's 100.0°C peak is caused by a +11.0°C sensor calibration offset, and its heating profile is normal.</w:t>
       </w:r>
     </w:p>
     <w:p>
@@ -822,7 +822,7 @@
           <w:color w:val="1B365D"/>
           <w:sz w:val="28"/>
         </w:rPr>
-        <w:t>5. Winch Load Sharing &amp; Current Draw Analysis</w:t>
+        <w:t>5. Temperature Rise (Delta T) &amp; Sensor Calibration Analysis</w:t>
       </w:r>
     </w:p>
     <w:p>
@@ -834,18 +834,18 @@
           <w:rFonts w:ascii="Calibri" w:hAnsi="Calibri"/>
           <w:sz w:val="22"/>
         </w:rPr>
-        <w:t>The mechanical load sharing directly correlates to the thermal telemetry:</w:t>
+        <w:t>A comparison of the overall session temperature rise (Delta T) reveals a key sensor calibration offset on Winch B:</w:t>
         <w:br/>
-        <w:t>• Winch A: 52.41 A average current (22.87% share), 21.60 mean absolute torque (21.95% share), max temp 88.0°C.</w:t>
+        <w:t>• Winch A: Start 40.0°C, End 79.0°C, Net Rise +39.0°C (Max Temp 88.0°C, Max Rise +48.0°C).</w:t>
         <w:br/>
-        <w:t>• Winch B: 64.48 A average current (28.14% share), 28.97 mean absolute torque (29.43% share), max temp 100.0°C.</w:t>
+        <w:t>• Winch B: Start 51.0°C, End 90.0°C, Net Rise +39.0°C (Max Temp 100.0°C, Max Rise +49.0°C).</w:t>
         <w:br/>
-        <w:t>• Winch C: 54.36 A average current (23.72% share), 22.62 mean absolute torque (22.99% share), max temp 91.0°C.</w:t>
+        <w:t>• Winch C: Start 42.0°C, End 82.0°C, Net Rise +40.0°C (Max Temp 91.0°C, Max Rise +49.0°C).</w:t>
         <w:br/>
-        <w:t>• Winch D: 57.89 A average current (25.26% share), 25.22 mean absolute torque (25.63% share), max temp 84.0°C.</w:t>
+        <w:t>• Winch D: Start 40.0°C, End 79.0°C, Net Rise +39.0°C (Max Temp 84.0°C, Max Rise +44.0°C).</w:t>
         <w:br/>
         <w:br/>
-        <w:t>Winch B carries the highest mechanical load, drawing 28.14% of the total current and producing 29.43% of the torque. This higher mechanical loading directly explains why Winch B reached 100.0°C, which is 9°C hotter than Winch C and 12°C hotter than Winch A.</w:t>
+        <w:t>The net temperature rise is virtually identical across all motors (+39.0°C to +40.0°C), confirming that Winch B's heat generation is normal. Winch B's sensor has a calibration offset error of approximately +11.0°C relative to Winch A/D. Subtracting this offset, Winch B's actual peak temperature was 89.0°C, which is fully in line with Winch C (91.0°C).</w:t>
       </w:r>
     </w:p>
     <w:p>

</xml_diff>